<commit_message>
Update report formatting and rename submission PDF
</commit_message>
<xml_diff>
--- a/Trusted-Computing-CIA2.docx
+++ b/Trusted-Computing-CIA2.docx
@@ -76,8 +76,38 @@
         <w:jc w:val="center"/>
       </w:pPr>
       <w:r>
-        <w:t>GitHub Repository: priyajitbiswal/trusted-computing-tpm-lab</w:t>
-      </w:r>
+        <w:t xml:space="preserve">GitHub Repository: </w:t>
+      </w:r>
+      <w:hyperlink r:id="rId6" w:history="1">
+        <w:proofErr w:type="spellStart"/>
+        <w:r>
+          <w:rPr>
+            <w:rStyle w:val="Hyperlink"/>
+          </w:rPr>
+          <w:t>priyajitbiswal</w:t>
+        </w:r>
+        <w:proofErr w:type="spellEnd"/>
+        <w:r>
+          <w:rPr>
+            <w:rStyle w:val="Hyperlink"/>
+          </w:rPr>
+          <w:t>/trusted-computing-</w:t>
+        </w:r>
+        <w:proofErr w:type="spellStart"/>
+        <w:r>
+          <w:rPr>
+            <w:rStyle w:val="Hyperlink"/>
+          </w:rPr>
+          <w:t>tpm</w:t>
+        </w:r>
+        <w:proofErr w:type="spellEnd"/>
+        <w:r>
+          <w:rPr>
+            <w:rStyle w:val="Hyperlink"/>
+          </w:rPr>
+          <w:t>-lab</w:t>
+        </w:r>
+      </w:hyperlink>
     </w:p>
     <w:p>
       <w:pPr>
@@ -392,19 +422,61 @@
         <w:rPr>
           <w:sz w:val="23"/>
         </w:rPr>
-        <w:t xml:space="preserve"> PCR_new = SHA</w:t>
-      </w:r>
-      <w:r>
-        <w:rPr>
-          <w:sz w:val="23"/>
-        </w:rPr>
-        <w:t>256(PCR</w:t>
-      </w:r>
-      <w:r>
-        <w:rPr>
-          <w:sz w:val="23"/>
-        </w:rPr>
-        <w:t>_old + New_Measurement)</w:t>
+        <w:t xml:space="preserve"> </w:t>
+      </w:r>
+      <w:proofErr w:type="spellStart"/>
+      <w:r>
+        <w:rPr>
+          <w:sz w:val="23"/>
+        </w:rPr>
+        <w:t>PCR_new</w:t>
+      </w:r>
+      <w:proofErr w:type="spellEnd"/>
+      <w:r>
+        <w:rPr>
+          <w:sz w:val="23"/>
+        </w:rPr>
+        <w:t xml:space="preserve"> = SHA</w:t>
+      </w:r>
+      <w:r>
+        <w:rPr>
+          <w:sz w:val="23"/>
+        </w:rPr>
+        <w:t>256(</w:t>
+      </w:r>
+      <w:proofErr w:type="spellStart"/>
+      <w:r>
+        <w:rPr>
+          <w:sz w:val="23"/>
+        </w:rPr>
+        <w:t>PCR</w:t>
+      </w:r>
+      <w:r>
+        <w:rPr>
+          <w:sz w:val="23"/>
+        </w:rPr>
+        <w:t>_old</w:t>
+      </w:r>
+      <w:proofErr w:type="spellEnd"/>
+      <w:r>
+        <w:rPr>
+          <w:sz w:val="23"/>
+        </w:rPr>
+        <w:t xml:space="preserve"> + </w:t>
+      </w:r>
+      <w:proofErr w:type="spellStart"/>
+      <w:r>
+        <w:rPr>
+          <w:sz w:val="23"/>
+        </w:rPr>
+        <w:t>New_Measurement</w:t>
+      </w:r>
+      <w:proofErr w:type="spellEnd"/>
+      <w:r>
+        <w:rPr>
+          <w:sz w:val="23"/>
+        </w:rPr>
+        <w:t>)</w:t>
       </w:r>
       <w:r>
         <w:rPr>
@@ -698,7 +770,21 @@
         <w:rPr>
           <w:sz w:val="23"/>
         </w:rPr>
-        <w:t>Using ARM TrustZone as an example, the main components are the following:</w:t>
+        <w:t xml:space="preserve">Using ARM </w:t>
+      </w:r>
+      <w:proofErr w:type="spellStart"/>
+      <w:r>
+        <w:rPr>
+          <w:sz w:val="23"/>
+        </w:rPr>
+        <w:t>TrustZone</w:t>
+      </w:r>
+      <w:proofErr w:type="spellEnd"/>
+      <w:r>
+        <w:rPr>
+          <w:sz w:val="23"/>
+        </w:rPr>
+        <w:t xml:space="preserve"> as an example, the main components are the following:</w:t>
       </w:r>
     </w:p>
     <w:p>
@@ -1146,7 +1232,21 @@
               <w:rPr>
                 <w:sz w:val="22"/>
               </w:rPr>
-              <w:t>Built directly inside the main CPU core (like ARM TrustZone).</w:t>
+              <w:t xml:space="preserve">Built directly inside the main CPU core (like ARM </w:t>
+            </w:r>
+            <w:proofErr w:type="spellStart"/>
+            <w:r>
+              <w:rPr>
+                <w:sz w:val="22"/>
+              </w:rPr>
+              <w:t>TrustZone</w:t>
+            </w:r>
+            <w:proofErr w:type="spellEnd"/>
+            <w:r>
+              <w:rPr>
+                <w:sz w:val="22"/>
+              </w:rPr>
+              <w:t>).</w:t>
             </w:r>
           </w:p>
         </w:tc>
@@ -1598,7 +1698,21 @@
         <w:rPr>
           <w:sz w:val="23"/>
         </w:rPr>
-        <w:t>This lab was completed using the software TPM (swtpm) and the tpm2-tools package on Ubuntu Linux. The task was to generate an encryption key, seal some sensitive information to a PCR register, and demonstrate that the TPM can unseal the information when the PCR is measured but not when it has been tampered.</w:t>
+        <w:t>This lab was completed using the software TPM (</w:t>
+      </w:r>
+      <w:proofErr w:type="spellStart"/>
+      <w:r>
+        <w:rPr>
+          <w:sz w:val="23"/>
+        </w:rPr>
+        <w:t>swtpm</w:t>
+      </w:r>
+      <w:proofErr w:type="spellEnd"/>
+      <w:r>
+        <w:rPr>
+          <w:sz w:val="23"/>
+        </w:rPr>
+        <w:t>) and the tpm2-tools package on Ubuntu Linux. The task was to generate an encryption key, seal some sensitive information to a PCR register, and demonstrate that the TPM can unseal the information when the PCR is measured but not when it has been tampered.</w:t>
       </w:r>
     </w:p>
     <w:p>
@@ -1657,7 +1771,21 @@
         <w:rPr>
           <w:sz w:val="23"/>
         </w:rPr>
-        <w:t>To set up the TPM environment safely, swtpm was launched in socket mode on ports 2321 and 2322. The following commands were executed:</w:t>
+        <w:t xml:space="preserve">To set up the TPM environment safely, </w:t>
+      </w:r>
+      <w:proofErr w:type="spellStart"/>
+      <w:r>
+        <w:rPr>
+          <w:sz w:val="23"/>
+        </w:rPr>
+        <w:t>swtpm</w:t>
+      </w:r>
+      <w:proofErr w:type="spellEnd"/>
+      <w:r>
+        <w:rPr>
+          <w:sz w:val="23"/>
+        </w:rPr>
+        <w:t xml:space="preserve"> was launched in socket mode on ports 2321 and 2322. The following commands were executed:</w:t>
       </w:r>
     </w:p>
     <w:p>
@@ -1679,90 +1807,482 @@
           <w:rFonts w:ascii="Consolas" w:hAnsi="Consolas"/>
           <w:sz w:val="20"/>
         </w:rPr>
-        <w:t># Setup directory and start swtpm in daemon mode</w:t>
-      </w:r>
-      <w:r>
-        <w:br/>
-      </w:r>
+        <w:t xml:space="preserve"># Setup directory and start </w:t>
+      </w:r>
+      <w:proofErr w:type="spellStart"/>
       <w:r>
         <w:rPr>
           <w:rFonts w:ascii="Consolas" w:hAnsi="Consolas"/>
           <w:sz w:val="20"/>
         </w:rPr>
-        <w:t>mkdir -p /tmp/tpm_lab &amp;&amp; cd /tmp/tpm_lab</w:t>
-      </w:r>
-      <w:r>
-        <w:br/>
-      </w:r>
+        <w:t>swtpm</w:t>
+      </w:r>
+      <w:proofErr w:type="spellEnd"/>
       <w:r>
         <w:rPr>
           <w:rFonts w:ascii="Consolas" w:hAnsi="Consolas"/>
           <w:sz w:val="20"/>
         </w:rPr>
-        <w:t>killall swtpm 2&gt;/dev/null || true</w:t>
+        <w:t xml:space="preserve"> in daemon mode</w:t>
       </w:r>
       <w:r>
         <w:br/>
       </w:r>
+      <w:proofErr w:type="spellStart"/>
       <w:r>
         <w:rPr>
           <w:rFonts w:ascii="Consolas" w:hAnsi="Consolas"/>
           <w:sz w:val="20"/>
         </w:rPr>
-        <w:t>rm -rf /tmp/mytpm &amp;&amp; mkdir -p /tmp/mytpm</w:t>
-      </w:r>
-      <w:r>
-        <w:br/>
-      </w:r>
+        <w:t>mkdir</w:t>
+      </w:r>
+      <w:proofErr w:type="spellEnd"/>
       <w:r>
         <w:rPr>
           <w:rFonts w:ascii="Consolas" w:hAnsi="Consolas"/>
           <w:sz w:val="20"/>
         </w:rPr>
-        <w:t>swtpm_setup --tpm2 --tpm-state /tmp/mytpm --createek</w:t>
-      </w:r>
-      <w:r>
-        <w:br/>
-      </w:r>
+        <w:t xml:space="preserve"> -p /</w:t>
+      </w:r>
+      <w:proofErr w:type="spellStart"/>
       <w:r>
         <w:rPr>
           <w:rFonts w:ascii="Consolas" w:hAnsi="Consolas"/>
           <w:sz w:val="20"/>
         </w:rPr>
-        <w:t>swtpm socket --tpm2 --tpmstate dir=/tmp/mytpm --server type=tcp,port=2321 \</w:t>
-      </w:r>
-      <w:r>
-        <w:br/>
-      </w:r>
+        <w:t>tmp</w:t>
+      </w:r>
+      <w:proofErr w:type="spellEnd"/>
       <w:r>
         <w:rPr>
           <w:rFonts w:ascii="Consolas" w:hAnsi="Consolas"/>
           <w:sz w:val="20"/>
         </w:rPr>
-        <w:t xml:space="preserve">             --ctrl type=tcp,port=2322 --flags not-need-init,startup-clear -d</w:t>
-      </w:r>
-      <w:r>
-        <w:br/>
-      </w:r>
-      <w:r>
-        <w:br/>
-      </w:r>
+        <w:t>/</w:t>
+      </w:r>
+      <w:proofErr w:type="spellStart"/>
       <w:r>
         <w:rPr>
           <w:rFonts w:ascii="Consolas" w:hAnsi="Consolas"/>
           <w:sz w:val="20"/>
         </w:rPr>
-        <w:t># Connect tpm2-tools to swtpm</w:t>
-      </w:r>
-      <w:r>
-        <w:br/>
-      </w:r>
+        <w:t>tpm_lab</w:t>
+      </w:r>
+      <w:proofErr w:type="spellEnd"/>
       <w:r>
         <w:rPr>
           <w:rFonts w:ascii="Consolas" w:hAnsi="Consolas"/>
           <w:sz w:val="20"/>
         </w:rPr>
-        <w:t>export TPM2TOOLS_TCTI="swtpm:port=2321"</w:t>
+        <w:t xml:space="preserve"> &amp;&amp; cd /</w:t>
+      </w:r>
+      <w:proofErr w:type="spellStart"/>
+      <w:r>
+        <w:rPr>
+          <w:rFonts w:ascii="Consolas" w:hAnsi="Consolas"/>
+          <w:sz w:val="20"/>
+        </w:rPr>
+        <w:t>tmp</w:t>
+      </w:r>
+      <w:proofErr w:type="spellEnd"/>
+      <w:r>
+        <w:rPr>
+          <w:rFonts w:ascii="Consolas" w:hAnsi="Consolas"/>
+          <w:sz w:val="20"/>
+        </w:rPr>
+        <w:t>/</w:t>
+      </w:r>
+      <w:proofErr w:type="spellStart"/>
+      <w:r>
+        <w:rPr>
+          <w:rFonts w:ascii="Consolas" w:hAnsi="Consolas"/>
+          <w:sz w:val="20"/>
+        </w:rPr>
+        <w:t>tpm_lab</w:t>
+      </w:r>
+      <w:proofErr w:type="spellEnd"/>
+      <w:r>
+        <w:br/>
+      </w:r>
+      <w:proofErr w:type="spellStart"/>
+      <w:r>
+        <w:rPr>
+          <w:rFonts w:ascii="Consolas" w:hAnsi="Consolas"/>
+          <w:sz w:val="20"/>
+        </w:rPr>
+        <w:t>killall</w:t>
+      </w:r>
+      <w:proofErr w:type="spellEnd"/>
+      <w:r>
+        <w:rPr>
+          <w:rFonts w:ascii="Consolas" w:hAnsi="Consolas"/>
+          <w:sz w:val="20"/>
+        </w:rPr>
+        <w:t xml:space="preserve"> </w:t>
+      </w:r>
+      <w:proofErr w:type="spellStart"/>
+      <w:r>
+        <w:rPr>
+          <w:rFonts w:ascii="Consolas" w:hAnsi="Consolas"/>
+          <w:sz w:val="20"/>
+        </w:rPr>
+        <w:t>swtpm</w:t>
+      </w:r>
+      <w:proofErr w:type="spellEnd"/>
+      <w:r>
+        <w:rPr>
+          <w:rFonts w:ascii="Consolas" w:hAnsi="Consolas"/>
+          <w:sz w:val="20"/>
+        </w:rPr>
+        <w:t xml:space="preserve"> 2&gt;/dev/null || true</w:t>
+      </w:r>
+      <w:r>
+        <w:br/>
+      </w:r>
+      <w:r>
+        <w:rPr>
+          <w:rFonts w:ascii="Consolas" w:hAnsi="Consolas"/>
+          <w:sz w:val="20"/>
+        </w:rPr>
+        <w:t>rm -rf /</w:t>
+      </w:r>
+      <w:proofErr w:type="spellStart"/>
+      <w:r>
+        <w:rPr>
+          <w:rFonts w:ascii="Consolas" w:hAnsi="Consolas"/>
+          <w:sz w:val="20"/>
+        </w:rPr>
+        <w:t>tmp</w:t>
+      </w:r>
+      <w:proofErr w:type="spellEnd"/>
+      <w:r>
+        <w:rPr>
+          <w:rFonts w:ascii="Consolas" w:hAnsi="Consolas"/>
+          <w:sz w:val="20"/>
+        </w:rPr>
+        <w:t>/</w:t>
+      </w:r>
+      <w:proofErr w:type="spellStart"/>
+      <w:r>
+        <w:rPr>
+          <w:rFonts w:ascii="Consolas" w:hAnsi="Consolas"/>
+          <w:sz w:val="20"/>
+        </w:rPr>
+        <w:t>mytpm</w:t>
+      </w:r>
+      <w:proofErr w:type="spellEnd"/>
+      <w:r>
+        <w:rPr>
+          <w:rFonts w:ascii="Consolas" w:hAnsi="Consolas"/>
+          <w:sz w:val="20"/>
+        </w:rPr>
+        <w:t xml:space="preserve"> &amp;&amp; </w:t>
+      </w:r>
+      <w:proofErr w:type="spellStart"/>
+      <w:r>
+        <w:rPr>
+          <w:rFonts w:ascii="Consolas" w:hAnsi="Consolas"/>
+          <w:sz w:val="20"/>
+        </w:rPr>
+        <w:t>mkdir</w:t>
+      </w:r>
+      <w:proofErr w:type="spellEnd"/>
+      <w:r>
+        <w:rPr>
+          <w:rFonts w:ascii="Consolas" w:hAnsi="Consolas"/>
+          <w:sz w:val="20"/>
+        </w:rPr>
+        <w:t xml:space="preserve"> -p /</w:t>
+      </w:r>
+      <w:proofErr w:type="spellStart"/>
+      <w:r>
+        <w:rPr>
+          <w:rFonts w:ascii="Consolas" w:hAnsi="Consolas"/>
+          <w:sz w:val="20"/>
+        </w:rPr>
+        <w:t>tmp</w:t>
+      </w:r>
+      <w:proofErr w:type="spellEnd"/>
+      <w:r>
+        <w:rPr>
+          <w:rFonts w:ascii="Consolas" w:hAnsi="Consolas"/>
+          <w:sz w:val="20"/>
+        </w:rPr>
+        <w:t>/</w:t>
+      </w:r>
+      <w:proofErr w:type="spellStart"/>
+      <w:r>
+        <w:rPr>
+          <w:rFonts w:ascii="Consolas" w:hAnsi="Consolas"/>
+          <w:sz w:val="20"/>
+        </w:rPr>
+        <w:t>mytpm</w:t>
+      </w:r>
+      <w:proofErr w:type="spellEnd"/>
+      <w:r>
+        <w:br/>
+      </w:r>
+      <w:proofErr w:type="spellStart"/>
+      <w:r>
+        <w:rPr>
+          <w:rFonts w:ascii="Consolas" w:hAnsi="Consolas"/>
+          <w:sz w:val="20"/>
+        </w:rPr>
+        <w:t>swtpm_setup</w:t>
+      </w:r>
+      <w:proofErr w:type="spellEnd"/>
+      <w:r>
+        <w:rPr>
+          <w:rFonts w:ascii="Consolas" w:hAnsi="Consolas"/>
+          <w:sz w:val="20"/>
+        </w:rPr>
+        <w:t xml:space="preserve"> --tpm2 --</w:t>
+      </w:r>
+      <w:proofErr w:type="spellStart"/>
+      <w:r>
+        <w:rPr>
+          <w:rFonts w:ascii="Consolas" w:hAnsi="Consolas"/>
+          <w:sz w:val="20"/>
+        </w:rPr>
+        <w:t>tpm</w:t>
+      </w:r>
+      <w:proofErr w:type="spellEnd"/>
+      <w:r>
+        <w:rPr>
+          <w:rFonts w:ascii="Consolas" w:hAnsi="Consolas"/>
+          <w:sz w:val="20"/>
+        </w:rPr>
+        <w:t>-state /</w:t>
+      </w:r>
+      <w:proofErr w:type="spellStart"/>
+      <w:r>
+        <w:rPr>
+          <w:rFonts w:ascii="Consolas" w:hAnsi="Consolas"/>
+          <w:sz w:val="20"/>
+        </w:rPr>
+        <w:t>tmp</w:t>
+      </w:r>
+      <w:proofErr w:type="spellEnd"/>
+      <w:r>
+        <w:rPr>
+          <w:rFonts w:ascii="Consolas" w:hAnsi="Consolas"/>
+          <w:sz w:val="20"/>
+        </w:rPr>
+        <w:t>/</w:t>
+      </w:r>
+      <w:proofErr w:type="spellStart"/>
+      <w:r>
+        <w:rPr>
+          <w:rFonts w:ascii="Consolas" w:hAnsi="Consolas"/>
+          <w:sz w:val="20"/>
+        </w:rPr>
+        <w:t>mytpm</w:t>
+      </w:r>
+      <w:proofErr w:type="spellEnd"/>
+      <w:r>
+        <w:rPr>
+          <w:rFonts w:ascii="Consolas" w:hAnsi="Consolas"/>
+          <w:sz w:val="20"/>
+        </w:rPr>
+        <w:t xml:space="preserve"> --</w:t>
+      </w:r>
+      <w:proofErr w:type="spellStart"/>
+      <w:r>
+        <w:rPr>
+          <w:rFonts w:ascii="Consolas" w:hAnsi="Consolas"/>
+          <w:sz w:val="20"/>
+        </w:rPr>
+        <w:t>createek</w:t>
+      </w:r>
+      <w:proofErr w:type="spellEnd"/>
+      <w:r>
+        <w:br/>
+      </w:r>
+      <w:proofErr w:type="spellStart"/>
+      <w:r>
+        <w:rPr>
+          <w:rFonts w:ascii="Consolas" w:hAnsi="Consolas"/>
+          <w:sz w:val="20"/>
+        </w:rPr>
+        <w:t>swtpm</w:t>
+      </w:r>
+      <w:proofErr w:type="spellEnd"/>
+      <w:r>
+        <w:rPr>
+          <w:rFonts w:ascii="Consolas" w:hAnsi="Consolas"/>
+          <w:sz w:val="20"/>
+        </w:rPr>
+        <w:t xml:space="preserve"> socket --tpm2 --</w:t>
+      </w:r>
+      <w:proofErr w:type="spellStart"/>
+      <w:r>
+        <w:rPr>
+          <w:rFonts w:ascii="Consolas" w:hAnsi="Consolas"/>
+          <w:sz w:val="20"/>
+        </w:rPr>
+        <w:t>tpmstate</w:t>
+      </w:r>
+      <w:proofErr w:type="spellEnd"/>
+      <w:r>
+        <w:rPr>
+          <w:rFonts w:ascii="Consolas" w:hAnsi="Consolas"/>
+          <w:sz w:val="20"/>
+        </w:rPr>
+        <w:t xml:space="preserve"> </w:t>
+      </w:r>
+      <w:proofErr w:type="spellStart"/>
+      <w:r>
+        <w:rPr>
+          <w:rFonts w:ascii="Consolas" w:hAnsi="Consolas"/>
+          <w:sz w:val="20"/>
+        </w:rPr>
+        <w:t>dir</w:t>
+      </w:r>
+      <w:proofErr w:type="spellEnd"/>
+      <w:r>
+        <w:rPr>
+          <w:rFonts w:ascii="Consolas" w:hAnsi="Consolas"/>
+          <w:sz w:val="20"/>
+        </w:rPr>
+        <w:t>=/</w:t>
+      </w:r>
+      <w:proofErr w:type="spellStart"/>
+      <w:r>
+        <w:rPr>
+          <w:rFonts w:ascii="Consolas" w:hAnsi="Consolas"/>
+          <w:sz w:val="20"/>
+        </w:rPr>
+        <w:t>tmp</w:t>
+      </w:r>
+      <w:proofErr w:type="spellEnd"/>
+      <w:r>
+        <w:rPr>
+          <w:rFonts w:ascii="Consolas" w:hAnsi="Consolas"/>
+          <w:sz w:val="20"/>
+        </w:rPr>
+        <w:t>/</w:t>
+      </w:r>
+      <w:proofErr w:type="spellStart"/>
+      <w:r>
+        <w:rPr>
+          <w:rFonts w:ascii="Consolas" w:hAnsi="Consolas"/>
+          <w:sz w:val="20"/>
+        </w:rPr>
+        <w:t>mytpm</w:t>
+      </w:r>
+      <w:proofErr w:type="spellEnd"/>
+      <w:r>
+        <w:rPr>
+          <w:rFonts w:ascii="Consolas" w:hAnsi="Consolas"/>
+          <w:sz w:val="20"/>
+        </w:rPr>
+        <w:t xml:space="preserve"> --server type=</w:t>
+      </w:r>
+      <w:proofErr w:type="spellStart"/>
+      <w:r>
+        <w:rPr>
+          <w:rFonts w:ascii="Consolas" w:hAnsi="Consolas"/>
+          <w:sz w:val="20"/>
+        </w:rPr>
+        <w:t>tcp,port</w:t>
+      </w:r>
+      <w:proofErr w:type="spellEnd"/>
+      <w:r>
+        <w:rPr>
+          <w:rFonts w:ascii="Consolas" w:hAnsi="Consolas"/>
+          <w:sz w:val="20"/>
+        </w:rPr>
+        <w:t>=2321 \</w:t>
+      </w:r>
+      <w:r>
+        <w:br/>
+      </w:r>
+      <w:r>
+        <w:rPr>
+          <w:rFonts w:ascii="Consolas" w:hAnsi="Consolas"/>
+          <w:sz w:val="20"/>
+        </w:rPr>
+        <w:t xml:space="preserve">             --ctrl type=</w:t>
+      </w:r>
+      <w:proofErr w:type="spellStart"/>
+      <w:r>
+        <w:rPr>
+          <w:rFonts w:ascii="Consolas" w:hAnsi="Consolas"/>
+          <w:sz w:val="20"/>
+        </w:rPr>
+        <w:t>tcp,port</w:t>
+      </w:r>
+      <w:proofErr w:type="spellEnd"/>
+      <w:r>
+        <w:rPr>
+          <w:rFonts w:ascii="Consolas" w:hAnsi="Consolas"/>
+          <w:sz w:val="20"/>
+        </w:rPr>
+        <w:t>=2322 --flags not-need-</w:t>
+      </w:r>
+      <w:proofErr w:type="spellStart"/>
+      <w:r>
+        <w:rPr>
+          <w:rFonts w:ascii="Consolas" w:hAnsi="Consolas"/>
+          <w:sz w:val="20"/>
+        </w:rPr>
+        <w:t>init,startup</w:t>
+      </w:r>
+      <w:proofErr w:type="spellEnd"/>
+      <w:r>
+        <w:rPr>
+          <w:rFonts w:ascii="Consolas" w:hAnsi="Consolas"/>
+          <w:sz w:val="20"/>
+        </w:rPr>
+        <w:t>-clear -d</w:t>
+      </w:r>
+      <w:r>
+        <w:br/>
+      </w:r>
+      <w:r>
+        <w:br/>
+      </w:r>
+      <w:r>
+        <w:rPr>
+          <w:rFonts w:ascii="Consolas" w:hAnsi="Consolas"/>
+          <w:sz w:val="20"/>
+        </w:rPr>
+        <w:t xml:space="preserve"># Connect tpm2-tools to </w:t>
+      </w:r>
+      <w:proofErr w:type="spellStart"/>
+      <w:r>
+        <w:rPr>
+          <w:rFonts w:ascii="Consolas" w:hAnsi="Consolas"/>
+          <w:sz w:val="20"/>
+        </w:rPr>
+        <w:t>swtpm</w:t>
+      </w:r>
+      <w:proofErr w:type="spellEnd"/>
+      <w:r>
+        <w:br/>
+      </w:r>
+      <w:r>
+        <w:rPr>
+          <w:rFonts w:ascii="Consolas" w:hAnsi="Consolas"/>
+          <w:sz w:val="20"/>
+        </w:rPr>
+        <w:t>export TPM2TOOLS_TCTI="</w:t>
+      </w:r>
+      <w:proofErr w:type="spellStart"/>
+      <w:r>
+        <w:rPr>
+          <w:rFonts w:ascii="Consolas" w:hAnsi="Consolas"/>
+          <w:sz w:val="20"/>
+        </w:rPr>
+        <w:t>swtpm:port</w:t>
+      </w:r>
+      <w:proofErr w:type="spellEnd"/>
+      <w:r>
+        <w:rPr>
+          <w:rFonts w:ascii="Consolas" w:hAnsi="Consolas"/>
+          <w:sz w:val="20"/>
+        </w:rPr>
+        <w:t>=2321"</w:t>
       </w:r>
       <w:r>
         <w:br/>
@@ -1900,7 +2420,7 @@
                     </pic:cNvPicPr>
                   </pic:nvPicPr>
                   <pic:blipFill>
-                    <a:blip r:embed="rId6">
+                    <a:blip r:embed="rId7">
                       <a:extLst>
                         <a:ext uri="{28A0092B-C50C-407E-A947-70E740481C1C}">
                           <a14:useLocalDpi xmlns:a14="http://schemas.microsoft.com/office/drawing/2010/main" val="0"/>
@@ -2053,40 +2573,35 @@
           <w:rFonts w:ascii="Consolas" w:hAnsi="Consolas"/>
           <w:sz w:val="20"/>
         </w:rPr>
-        <w:t>tpm2_createprimary -C o -g sha256 -G rsa -c primary.ctx</w:t>
-      </w:r>
-      <w:r>
-        <w:br/>
-      </w:r>
-      <w:r>
-        <w:br/>
-      </w:r>
+        <w:t xml:space="preserve">tpm2_createprimary -C o -g sha256 -G </w:t>
+      </w:r>
+      <w:proofErr w:type="spellStart"/>
       <w:r>
         <w:rPr>
           <w:rFonts w:ascii="Consolas" w:hAnsi="Consolas"/>
           <w:sz w:val="20"/>
         </w:rPr>
-        <w:t># 3. Read current PCR 16 value and create a policy from it</w:t>
-      </w:r>
-      <w:r>
-        <w:br/>
-      </w:r>
+        <w:t>rsa</w:t>
+      </w:r>
+      <w:proofErr w:type="spellEnd"/>
       <w:r>
         <w:rPr>
           <w:rFonts w:ascii="Consolas" w:hAnsi="Consolas"/>
           <w:sz w:val="20"/>
         </w:rPr>
-        <w:t>tpm2_pcrread sha256:16 -o pcr16_val.bin</w:t>
-      </w:r>
-      <w:r>
-        <w:br/>
-      </w:r>
+        <w:t xml:space="preserve"> -c </w:t>
+      </w:r>
+      <w:proofErr w:type="spellStart"/>
       <w:r>
         <w:rPr>
           <w:rFonts w:ascii="Consolas" w:hAnsi="Consolas"/>
           <w:sz w:val="20"/>
         </w:rPr>
-        <w:t>tpm2_createpolicy --policy-pcr -l sha256:16 -f pcr16_val.bin -L pcr16.policy</w:t>
+        <w:t>primary.ctx</w:t>
+      </w:r>
+      <w:proofErr w:type="spellEnd"/>
+      <w:r>
+        <w:br/>
       </w:r>
       <w:r>
         <w:br/>
@@ -2096,10 +2611,7 @@
           <w:rFonts w:ascii="Consolas" w:hAnsi="Consolas"/>
           <w:sz w:val="20"/>
         </w:rPr>
-        <w:t>xxd -p pcr16.policy</w:t>
-      </w:r>
-      <w:r>
-        <w:br/>
+        <w:t># 3. Read current PCR 16 value and create a policy from it</w:t>
       </w:r>
       <w:r>
         <w:br/>
@@ -2109,7 +2621,7 @@
           <w:rFonts w:ascii="Consolas" w:hAnsi="Consolas"/>
           <w:sz w:val="20"/>
         </w:rPr>
-        <w:t># 4. Seal the secret file to the policy and load into TPM memory</w:t>
+        <w:t>tpm2_pcrread sha256:16 -o pcr16_val.bin</w:t>
       </w:r>
       <w:r>
         <w:br/>
@@ -2119,28 +2631,175 @@
           <w:rFonts w:ascii="Consolas" w:hAnsi="Consolas"/>
           <w:sz w:val="20"/>
         </w:rPr>
-        <w:t>tpm2_create -C primary.ctx -u sealed.pub -r sealed.priv -i secret_payload.txt -L pcr16.policy</w:t>
-      </w:r>
-      <w:r>
-        <w:br/>
-      </w:r>
+        <w:t>tpm2_createpolicy --policy-</w:t>
+      </w:r>
+      <w:proofErr w:type="spellStart"/>
       <w:r>
         <w:rPr>
           <w:rFonts w:ascii="Consolas" w:hAnsi="Consolas"/>
           <w:sz w:val="20"/>
         </w:rPr>
-        <w:t>tpm2_flushcontext -t</w:t>
-      </w:r>
-      <w:r>
-        <w:br/>
-      </w:r>
+        <w:t>pcr</w:t>
+      </w:r>
+      <w:proofErr w:type="spellEnd"/>
       <w:r>
         <w:rPr>
           <w:rFonts w:ascii="Consolas" w:hAnsi="Consolas"/>
           <w:sz w:val="20"/>
         </w:rPr>
-        <w:t>tpm2_load -C primary.ctx -u sealed.pub -r sealed.priv -c sealed.ctx</w:t>
-      </w:r>
+        <w:t xml:space="preserve"> -l sha256:16 -f pcr16_val.bin -L pcr16.policy</w:t>
+      </w:r>
+      <w:r>
+        <w:br/>
+      </w:r>
+      <w:proofErr w:type="spellStart"/>
+      <w:r>
+        <w:rPr>
+          <w:rFonts w:ascii="Consolas" w:hAnsi="Consolas"/>
+          <w:sz w:val="20"/>
+        </w:rPr>
+        <w:t>xxd</w:t>
+      </w:r>
+      <w:proofErr w:type="spellEnd"/>
+      <w:r>
+        <w:rPr>
+          <w:rFonts w:ascii="Consolas" w:hAnsi="Consolas"/>
+          <w:sz w:val="20"/>
+        </w:rPr>
+        <w:t xml:space="preserve"> -p pcr16.policy</w:t>
+      </w:r>
+      <w:r>
+        <w:br/>
+      </w:r>
+      <w:r>
+        <w:br/>
+      </w:r>
+      <w:r>
+        <w:rPr>
+          <w:rFonts w:ascii="Consolas" w:hAnsi="Consolas"/>
+          <w:sz w:val="20"/>
+        </w:rPr>
+        <w:t># 4. Seal the secret file to the policy and load into TPM memory</w:t>
+      </w:r>
+      <w:r>
+        <w:br/>
+      </w:r>
+      <w:r>
+        <w:rPr>
+          <w:rFonts w:ascii="Consolas" w:hAnsi="Consolas"/>
+          <w:sz w:val="20"/>
+        </w:rPr>
+        <w:t xml:space="preserve">tpm2_create -C </w:t>
+      </w:r>
+      <w:proofErr w:type="spellStart"/>
+      <w:r>
+        <w:rPr>
+          <w:rFonts w:ascii="Consolas" w:hAnsi="Consolas"/>
+          <w:sz w:val="20"/>
+        </w:rPr>
+        <w:t>primary.ctx</w:t>
+      </w:r>
+      <w:proofErr w:type="spellEnd"/>
+      <w:r>
+        <w:rPr>
+          <w:rFonts w:ascii="Consolas" w:hAnsi="Consolas"/>
+          <w:sz w:val="20"/>
+        </w:rPr>
+        <w:t xml:space="preserve"> -u sealed.pub -r </w:t>
+      </w:r>
+      <w:proofErr w:type="spellStart"/>
+      <w:r>
+        <w:rPr>
+          <w:rFonts w:ascii="Consolas" w:hAnsi="Consolas"/>
+          <w:sz w:val="20"/>
+        </w:rPr>
+        <w:t>sealed.priv</w:t>
+      </w:r>
+      <w:proofErr w:type="spellEnd"/>
+      <w:r>
+        <w:rPr>
+          <w:rFonts w:ascii="Consolas" w:hAnsi="Consolas"/>
+          <w:sz w:val="20"/>
+        </w:rPr>
+        <w:t xml:space="preserve"> -</w:t>
+      </w:r>
+      <w:proofErr w:type="spellStart"/>
+      <w:r>
+        <w:rPr>
+          <w:rFonts w:ascii="Consolas" w:hAnsi="Consolas"/>
+          <w:sz w:val="20"/>
+        </w:rPr>
+        <w:t>i</w:t>
+      </w:r>
+      <w:proofErr w:type="spellEnd"/>
+      <w:r>
+        <w:rPr>
+          <w:rFonts w:ascii="Consolas" w:hAnsi="Consolas"/>
+          <w:sz w:val="20"/>
+        </w:rPr>
+        <w:t xml:space="preserve"> secret_payload.txt -L pcr16.policy</w:t>
+      </w:r>
+      <w:r>
+        <w:br/>
+      </w:r>
+      <w:r>
+        <w:rPr>
+          <w:rFonts w:ascii="Consolas" w:hAnsi="Consolas"/>
+          <w:sz w:val="20"/>
+        </w:rPr>
+        <w:t>tpm2_flushcontext -t</w:t>
+      </w:r>
+      <w:r>
+        <w:br/>
+      </w:r>
+      <w:r>
+        <w:rPr>
+          <w:rFonts w:ascii="Consolas" w:hAnsi="Consolas"/>
+          <w:sz w:val="20"/>
+        </w:rPr>
+        <w:t xml:space="preserve">tpm2_load -C </w:t>
+      </w:r>
+      <w:proofErr w:type="spellStart"/>
+      <w:r>
+        <w:rPr>
+          <w:rFonts w:ascii="Consolas" w:hAnsi="Consolas"/>
+          <w:sz w:val="20"/>
+        </w:rPr>
+        <w:t>primary.ctx</w:t>
+      </w:r>
+      <w:proofErr w:type="spellEnd"/>
+      <w:r>
+        <w:rPr>
+          <w:rFonts w:ascii="Consolas" w:hAnsi="Consolas"/>
+          <w:sz w:val="20"/>
+        </w:rPr>
+        <w:t xml:space="preserve"> -u sealed.pub -r </w:t>
+      </w:r>
+      <w:proofErr w:type="spellStart"/>
+      <w:r>
+        <w:rPr>
+          <w:rFonts w:ascii="Consolas" w:hAnsi="Consolas"/>
+          <w:sz w:val="20"/>
+        </w:rPr>
+        <w:t>sealed.priv</w:t>
+      </w:r>
+      <w:proofErr w:type="spellEnd"/>
+      <w:r>
+        <w:rPr>
+          <w:rFonts w:ascii="Consolas" w:hAnsi="Consolas"/>
+          <w:sz w:val="20"/>
+        </w:rPr>
+        <w:t xml:space="preserve"> -c </w:t>
+      </w:r>
+      <w:proofErr w:type="spellStart"/>
+      <w:r>
+        <w:rPr>
+          <w:rFonts w:ascii="Consolas" w:hAnsi="Consolas"/>
+          <w:sz w:val="20"/>
+        </w:rPr>
+        <w:t>sealed.ctx</w:t>
+      </w:r>
+      <w:proofErr w:type="spellEnd"/>
     </w:p>
     <w:p>
       <w:pPr>
@@ -2217,7 +2876,21 @@
         <w:rPr>
           <w:sz w:val="23"/>
         </w:rPr>
-        <w:t>An RSA 2048-bit primary key was created under handle primary.ctx.</w:t>
+        <w:t xml:space="preserve">An RSA 2048-bit primary key was created under handle </w:t>
+      </w:r>
+      <w:proofErr w:type="spellStart"/>
+      <w:r>
+        <w:rPr>
+          <w:sz w:val="23"/>
+        </w:rPr>
+        <w:t>primary.ctx</w:t>
+      </w:r>
+      <w:proofErr w:type="spellEnd"/>
+      <w:r>
+        <w:rPr>
+          <w:sz w:val="23"/>
+        </w:rPr>
+        <w:t>.</w:t>
       </w:r>
       <w:r>
         <w:rPr>
@@ -2300,7 +2973,21 @@
         <w:rPr>
           <w:sz w:val="23"/>
         </w:rPr>
-        <w:t>TPM memory as sealed.ctx.</w:t>
+        <w:t xml:space="preserve">TPM memory as </w:t>
+      </w:r>
+      <w:proofErr w:type="spellStart"/>
+      <w:r>
+        <w:rPr>
+          <w:sz w:val="23"/>
+        </w:rPr>
+        <w:t>sealed.ctx</w:t>
+      </w:r>
+      <w:proofErr w:type="spellEnd"/>
+      <w:r>
+        <w:rPr>
+          <w:sz w:val="23"/>
+        </w:rPr>
+        <w:t>.</w:t>
       </w:r>
     </w:p>
     <w:p>
@@ -2334,7 +3021,7 @@
                     </pic:cNvPicPr>
                   </pic:nvPicPr>
                   <pic:blipFill>
-                    <a:blip r:embed="rId7">
+                    <a:blip r:embed="rId8">
                       <a:extLst>
                         <a:ext uri="{28A0092B-C50C-407E-A947-70E740481C1C}">
                           <a14:useLocalDpi xmlns:a14="http://schemas.microsoft.com/office/drawing/2010/main" val="0"/>
@@ -2392,7 +3079,7 @@
                     </pic:cNvPicPr>
                   </pic:nvPicPr>
                   <pic:blipFill>
-                    <a:blip r:embed="rId8">
+                    <a:blip r:embed="rId9">
                       <a:extLst>
                         <a:ext uri="{28A0092B-C50C-407E-A947-70E740481C1C}">
                           <a14:useLocalDpi xmlns:a14="http://schemas.microsoft.com/office/drawing/2010/main" val="0"/>
@@ -2546,44 +3233,37 @@
           <w:rFonts w:ascii="Consolas" w:hAnsi="Consolas"/>
           <w:sz w:val="20"/>
         </w:rPr>
-        <w:t xml:space="preserve">tpm2_startauthsession -S session.ctx </w:t>
-      </w:r>
+        <w:t xml:space="preserve">tpm2_startauthsession -S </w:t>
+      </w:r>
+      <w:proofErr w:type="spellStart"/>
       <w:r>
         <w:rPr>
           <w:rFonts w:ascii="Consolas" w:hAnsi="Consolas"/>
           <w:sz w:val="20"/>
         </w:rPr>
-        <w:t>–</w:t>
-      </w:r>
+        <w:t>session.ctx</w:t>
+      </w:r>
+      <w:proofErr w:type="spellEnd"/>
       <w:r>
         <w:rPr>
           <w:rFonts w:ascii="Consolas" w:hAnsi="Consolas"/>
           <w:sz w:val="20"/>
         </w:rPr>
-        <w:t>policy-session</w:t>
-      </w:r>
-      <w:r>
-        <w:br/>
+        <w:t xml:space="preserve"> </w:t>
       </w:r>
       <w:r>
         <w:rPr>
           <w:rFonts w:ascii="Consolas" w:hAnsi="Consolas"/>
           <w:sz w:val="20"/>
         </w:rPr>
-        <w:t>tpm2_policypcr -S session.ctx -l sha256:16</w:t>
-      </w:r>
-      <w:r>
-        <w:br/>
-      </w:r>
-      <w:r>
-        <w:br/>
+        <w:t>–</w:t>
       </w:r>
       <w:r>
         <w:rPr>
           <w:rFonts w:ascii="Consolas" w:hAnsi="Consolas"/>
           <w:sz w:val="20"/>
         </w:rPr>
-        <w:t># Unseal the secret</w:t>
+        <w:t>policy-session</w:t>
       </w:r>
       <w:r>
         <w:br/>
@@ -2593,18 +3273,98 @@
           <w:rFonts w:ascii="Consolas" w:hAnsi="Consolas"/>
           <w:sz w:val="20"/>
         </w:rPr>
-        <w:t>tpm2_unseal -p session:session.ctx -c sealed.ctx -o unsealed_output.txt</w:t>
-      </w:r>
-      <w:r>
-        <w:br/>
-      </w:r>
+        <w:t xml:space="preserve">tpm2_policypcr -S </w:t>
+      </w:r>
+      <w:proofErr w:type="spellStart"/>
       <w:r>
         <w:rPr>
           <w:rFonts w:ascii="Consolas" w:hAnsi="Consolas"/>
           <w:sz w:val="20"/>
         </w:rPr>
-        <w:t>tpm2_flushcontext session.ctx</w:t>
-      </w:r>
+        <w:t>session.ctx</w:t>
+      </w:r>
+      <w:proofErr w:type="spellEnd"/>
+      <w:r>
+        <w:rPr>
+          <w:rFonts w:ascii="Consolas" w:hAnsi="Consolas"/>
+          <w:sz w:val="20"/>
+        </w:rPr>
+        <w:t xml:space="preserve"> -l sha256:16</w:t>
+      </w:r>
+      <w:r>
+        <w:br/>
+      </w:r>
+      <w:r>
+        <w:br/>
+      </w:r>
+      <w:r>
+        <w:rPr>
+          <w:rFonts w:ascii="Consolas" w:hAnsi="Consolas"/>
+          <w:sz w:val="20"/>
+        </w:rPr>
+        <w:t># Unseal the secret</w:t>
+      </w:r>
+      <w:r>
+        <w:br/>
+      </w:r>
+      <w:r>
+        <w:rPr>
+          <w:rFonts w:ascii="Consolas" w:hAnsi="Consolas"/>
+          <w:sz w:val="20"/>
+        </w:rPr>
+        <w:t xml:space="preserve">tpm2_unseal -p </w:t>
+      </w:r>
+      <w:proofErr w:type="spellStart"/>
+      <w:r>
+        <w:rPr>
+          <w:rFonts w:ascii="Consolas" w:hAnsi="Consolas"/>
+          <w:sz w:val="20"/>
+        </w:rPr>
+        <w:t>session:session.ctx</w:t>
+      </w:r>
+      <w:proofErr w:type="spellEnd"/>
+      <w:r>
+        <w:rPr>
+          <w:rFonts w:ascii="Consolas" w:hAnsi="Consolas"/>
+          <w:sz w:val="20"/>
+        </w:rPr>
+        <w:t xml:space="preserve"> -c </w:t>
+      </w:r>
+      <w:proofErr w:type="spellStart"/>
+      <w:r>
+        <w:rPr>
+          <w:rFonts w:ascii="Consolas" w:hAnsi="Consolas"/>
+          <w:sz w:val="20"/>
+        </w:rPr>
+        <w:t>sealed.ctx</w:t>
+      </w:r>
+      <w:proofErr w:type="spellEnd"/>
+      <w:r>
+        <w:rPr>
+          <w:rFonts w:ascii="Consolas" w:hAnsi="Consolas"/>
+          <w:sz w:val="20"/>
+        </w:rPr>
+        <w:t xml:space="preserve"> -o unsealed_output.txt</w:t>
+      </w:r>
+      <w:r>
+        <w:br/>
+      </w:r>
+      <w:r>
+        <w:rPr>
+          <w:rFonts w:ascii="Consolas" w:hAnsi="Consolas"/>
+          <w:sz w:val="20"/>
+        </w:rPr>
+        <w:t xml:space="preserve">tpm2_flushcontext </w:t>
+      </w:r>
+      <w:proofErr w:type="spellStart"/>
+      <w:r>
+        <w:rPr>
+          <w:rFonts w:ascii="Consolas" w:hAnsi="Consolas"/>
+          <w:sz w:val="20"/>
+        </w:rPr>
+        <w:t>session.ctx</w:t>
+      </w:r>
+      <w:proofErr w:type="spellEnd"/>
       <w:r>
         <w:br/>
       </w:r>
@@ -2677,7 +3437,7 @@
                     </pic:cNvPicPr>
                   </pic:nvPicPr>
                   <pic:blipFill>
-                    <a:blip r:embed="rId9">
+                    <a:blip r:embed="rId10">
                       <a:extLst>
                         <a:ext uri="{28A0092B-C50C-407E-A947-70E740481C1C}">
                           <a14:useLocalDpi xmlns:a14="http://schemas.microsoft.com/office/drawing/2010/main" val="0"/>
@@ -2819,54 +3579,51 @@
           <w:rFonts w:ascii="Consolas" w:hAnsi="Consolas"/>
           <w:sz w:val="20"/>
         </w:rPr>
-        <w:t>tpm2_load -C primary.ctx -u sealed.pub -r sealed.priv -c sealed.ctx</w:t>
-      </w:r>
-      <w:r>
-        <w:br/>
-      </w:r>
-      <w:r>
-        <w:br/>
-      </w:r>
+        <w:t xml:space="preserve">tpm2_load -C </w:t>
+      </w:r>
+      <w:proofErr w:type="spellStart"/>
       <w:r>
         <w:rPr>
           <w:rFonts w:ascii="Consolas" w:hAnsi="Consolas"/>
           <w:sz w:val="20"/>
         </w:rPr>
-        <w:t># Attempt unseal under tampered state</w:t>
-      </w:r>
-      <w:r>
-        <w:br/>
-      </w:r>
+        <w:t>primary.ctx</w:t>
+      </w:r>
+      <w:proofErr w:type="spellEnd"/>
       <w:r>
         <w:rPr>
           <w:rFonts w:ascii="Consolas" w:hAnsi="Consolas"/>
           <w:sz w:val="20"/>
         </w:rPr>
-        <w:t xml:space="preserve">tpm2_startauthsession -S session.ctx </w:t>
-      </w:r>
+        <w:t xml:space="preserve"> -u sealed.pub -r </w:t>
+      </w:r>
+      <w:proofErr w:type="spellStart"/>
       <w:r>
         <w:rPr>
           <w:rFonts w:ascii="Consolas" w:hAnsi="Consolas"/>
           <w:sz w:val="20"/>
         </w:rPr>
-        <w:t>–</w:t>
-      </w:r>
+        <w:t>sealed.priv</w:t>
+      </w:r>
+      <w:proofErr w:type="spellEnd"/>
       <w:r>
         <w:rPr>
           <w:rFonts w:ascii="Consolas" w:hAnsi="Consolas"/>
           <w:sz w:val="20"/>
         </w:rPr>
-        <w:t>policy-session</w:t>
-      </w:r>
-      <w:r>
-        <w:br/>
-      </w:r>
+        <w:t xml:space="preserve"> -c </w:t>
+      </w:r>
+      <w:proofErr w:type="spellStart"/>
       <w:r>
         <w:rPr>
           <w:rFonts w:ascii="Consolas" w:hAnsi="Consolas"/>
           <w:sz w:val="20"/>
         </w:rPr>
-        <w:t>tpm2_policypcr -S session.ctx -l sha256:16</w:t>
+        <w:t>sealed.ctx</w:t>
+      </w:r>
+      <w:proofErr w:type="spellEnd"/>
+      <w:r>
+        <w:br/>
       </w:r>
       <w:r>
         <w:br/>
@@ -2876,7 +3633,7 @@
           <w:rFonts w:ascii="Consolas" w:hAnsi="Consolas"/>
           <w:sz w:val="20"/>
         </w:rPr>
-        <w:t>tpm2_unseal -p session:session.ctx -c sealed.ctx -o unsealed_tampered.txt</w:t>
+        <w:t># Attempt unseal under tampered state</w:t>
       </w:r>
       <w:r>
         <w:br/>
@@ -2886,8 +3643,125 @@
           <w:rFonts w:ascii="Consolas" w:hAnsi="Consolas"/>
           <w:sz w:val="20"/>
         </w:rPr>
-        <w:t>tpm2_flushcontext session.ctx</w:t>
-      </w:r>
+        <w:t xml:space="preserve">tpm2_startauthsession -S </w:t>
+      </w:r>
+      <w:proofErr w:type="spellStart"/>
+      <w:r>
+        <w:rPr>
+          <w:rFonts w:ascii="Consolas" w:hAnsi="Consolas"/>
+          <w:sz w:val="20"/>
+        </w:rPr>
+        <w:t>session.ctx</w:t>
+      </w:r>
+      <w:proofErr w:type="spellEnd"/>
+      <w:r>
+        <w:rPr>
+          <w:rFonts w:ascii="Consolas" w:hAnsi="Consolas"/>
+          <w:sz w:val="20"/>
+        </w:rPr>
+        <w:t xml:space="preserve"> </w:t>
+      </w:r>
+      <w:r>
+        <w:rPr>
+          <w:rFonts w:ascii="Consolas" w:hAnsi="Consolas"/>
+          <w:sz w:val="20"/>
+        </w:rPr>
+        <w:t>–</w:t>
+      </w:r>
+      <w:r>
+        <w:rPr>
+          <w:rFonts w:ascii="Consolas" w:hAnsi="Consolas"/>
+          <w:sz w:val="20"/>
+        </w:rPr>
+        <w:t>policy-session</w:t>
+      </w:r>
+      <w:r>
+        <w:br/>
+      </w:r>
+      <w:r>
+        <w:rPr>
+          <w:rFonts w:ascii="Consolas" w:hAnsi="Consolas"/>
+          <w:sz w:val="20"/>
+        </w:rPr>
+        <w:t xml:space="preserve">tpm2_policypcr -S </w:t>
+      </w:r>
+      <w:proofErr w:type="spellStart"/>
+      <w:r>
+        <w:rPr>
+          <w:rFonts w:ascii="Consolas" w:hAnsi="Consolas"/>
+          <w:sz w:val="20"/>
+        </w:rPr>
+        <w:t>session.ctx</w:t>
+      </w:r>
+      <w:proofErr w:type="spellEnd"/>
+      <w:r>
+        <w:rPr>
+          <w:rFonts w:ascii="Consolas" w:hAnsi="Consolas"/>
+          <w:sz w:val="20"/>
+        </w:rPr>
+        <w:t xml:space="preserve"> -l sha256:16</w:t>
+      </w:r>
+      <w:r>
+        <w:br/>
+      </w:r>
+      <w:r>
+        <w:rPr>
+          <w:rFonts w:ascii="Consolas" w:hAnsi="Consolas"/>
+          <w:sz w:val="20"/>
+        </w:rPr>
+        <w:t xml:space="preserve">tpm2_unseal -p </w:t>
+      </w:r>
+      <w:proofErr w:type="spellStart"/>
+      <w:r>
+        <w:rPr>
+          <w:rFonts w:ascii="Consolas" w:hAnsi="Consolas"/>
+          <w:sz w:val="20"/>
+        </w:rPr>
+        <w:t>session:session.ctx</w:t>
+      </w:r>
+      <w:proofErr w:type="spellEnd"/>
+      <w:r>
+        <w:rPr>
+          <w:rFonts w:ascii="Consolas" w:hAnsi="Consolas"/>
+          <w:sz w:val="20"/>
+        </w:rPr>
+        <w:t xml:space="preserve"> -c </w:t>
+      </w:r>
+      <w:proofErr w:type="spellStart"/>
+      <w:r>
+        <w:rPr>
+          <w:rFonts w:ascii="Consolas" w:hAnsi="Consolas"/>
+          <w:sz w:val="20"/>
+        </w:rPr>
+        <w:t>sealed.ctx</w:t>
+      </w:r>
+      <w:proofErr w:type="spellEnd"/>
+      <w:r>
+        <w:rPr>
+          <w:rFonts w:ascii="Consolas" w:hAnsi="Consolas"/>
+          <w:sz w:val="20"/>
+        </w:rPr>
+        <w:t xml:space="preserve"> -o unsealed_tampered.txt</w:t>
+      </w:r>
+      <w:r>
+        <w:br/>
+      </w:r>
+      <w:r>
+        <w:rPr>
+          <w:rFonts w:ascii="Consolas" w:hAnsi="Consolas"/>
+          <w:sz w:val="20"/>
+        </w:rPr>
+        <w:t xml:space="preserve">tpm2_flushcontext </w:t>
+      </w:r>
+      <w:proofErr w:type="spellStart"/>
+      <w:r>
+        <w:rPr>
+          <w:rFonts w:ascii="Consolas" w:hAnsi="Consolas"/>
+          <w:sz w:val="20"/>
+        </w:rPr>
+        <w:t>session.ctx</w:t>
+      </w:r>
+      <w:proofErr w:type="spellEnd"/>
     </w:p>
     <w:p>
       <w:pPr>
@@ -2949,7 +3823,21 @@
           <w:sz w:val="23"/>
         </w:rPr>
         <w:br/>
-        <w:t xml:space="preserve">      ERROR: Esys_Unseal(0x99D) </w:t>
+        <w:t xml:space="preserve">      ERROR: </w:t>
+      </w:r>
+      <w:proofErr w:type="spellStart"/>
+      <w:r>
+        <w:rPr>
+          <w:sz w:val="23"/>
+        </w:rPr>
+        <w:t>Esys_Unseal</w:t>
+      </w:r>
+      <w:proofErr w:type="spellEnd"/>
+      <w:r>
+        <w:rPr>
+          <w:sz w:val="23"/>
+        </w:rPr>
+        <w:t xml:space="preserve">(0x99D) </w:t>
       </w:r>
       <w:r>
         <w:rPr>
@@ -2961,7 +3849,21 @@
         <w:rPr>
           <w:sz w:val="23"/>
         </w:rPr>
-        <w:t xml:space="preserve"> tpm:session(1):a policy check failed</w:t>
+        <w:t xml:space="preserve"> </w:t>
+      </w:r>
+      <w:proofErr w:type="spellStart"/>
+      <w:r>
+        <w:rPr>
+          <w:sz w:val="23"/>
+        </w:rPr>
+        <w:t>tpm:session</w:t>
+      </w:r>
+      <w:proofErr w:type="spellEnd"/>
+      <w:r>
+        <w:rPr>
+          <w:sz w:val="23"/>
+        </w:rPr>
+        <w:t>(1):a policy check failed</w:t>
       </w:r>
       <w:r>
         <w:rPr>
@@ -3021,7 +3923,7 @@
                     </pic:cNvPicPr>
                   </pic:nvPicPr>
                   <pic:blipFill>
-                    <a:blip r:embed="rId10">
+                    <a:blip r:embed="rId11">
                       <a:extLst>
                         <a:ext uri="{28A0092B-C50C-407E-A947-70E740481C1C}">
                           <a14:useLocalDpi xmlns:a14="http://schemas.microsoft.com/office/drawing/2010/main" val="0"/>
@@ -3169,19 +4071,7 @@
         <w:rPr>
           <w:sz w:val="23"/>
         </w:rPr>
-        <w:t xml:space="preserve">Laptop Theft and Offline Attacks: If a laptop is stolen but BitLocker or LUKS disk encryption is PCR-sealed, it will not be possible to simply boot the machine into another OS from a USB drive </w:t>
-      </w:r>
-      <w:r>
-        <w:rPr>
-          <w:sz w:val="23"/>
-        </w:rPr>
-        <w:t>to</w:t>
-      </w:r>
-      <w:r>
-        <w:rPr>
-          <w:sz w:val="23"/>
-        </w:rPr>
-        <w:t xml:space="preserve"> read the files. This is because booting into another OS will change PCR 0, 4, and 7, which will cause the TPM to refuse to release the disk's decryption key.</w:t>
+        <w:t>Laptop Theft and Offline Attacks: If a laptop is stolen but BitLocker or LUKS disk encryption is PCR-sealed, it will not be possible to simply boot the machine into another OS from a USB drive to read the files. This is because booting into another OS will change PCR 0, 4, and 7, which will cause the TPM to refuse to release the disk's decryption key.</w:t>
       </w:r>
     </w:p>
     <w:p>
@@ -3277,7 +4167,21 @@
         <w:rPr>
           <w:sz w:val="23"/>
         </w:rPr>
-        <w:t>I confirm that all the requirements of the CIA-2 standard were met. First, using the swtpm and tpm2-tools software, I created a TPM 2.0 object, then I sealed it to a PCR policy. Then, by meeting the PCR policy, I was able to unseal the object, and the secret text was displayed. Finally, by extending PCR 16 to simulate a tamper, the TPM refused to unseal the object with error code 0x99D. This whole process shows how hardware-enabled security is used to protect valuable data from unauthorized disclosure.</w:t>
+        <w:t xml:space="preserve">I confirm that all the requirements of the CIA-2 standard were met. First, using the </w:t>
+      </w:r>
+      <w:proofErr w:type="spellStart"/>
+      <w:r>
+        <w:rPr>
+          <w:sz w:val="23"/>
+        </w:rPr>
+        <w:t>swtpm</w:t>
+      </w:r>
+      <w:proofErr w:type="spellEnd"/>
+      <w:r>
+        <w:rPr>
+          <w:sz w:val="23"/>
+        </w:rPr>
+        <w:t xml:space="preserve"> and tpm2-tools software, I created a TPM 2.0 object, then I sealed it to a PCR policy. Then, by meeting the PCR policy, I was able to unseal the object, and the secret text was displayed. Finally, by extending PCR 16 to simulate a tamper, the TPM refused to unseal the object with error code 0x99D. This whole process shows how hardware-enabled security is used to protect valuable data from unauthorized disclosure.</w:t>
       </w:r>
     </w:p>
     <w:sectPr>
@@ -6546,6 +7450,7 @@
   <w:style w:type="character" w:default="1" w:styleId="DefaultParagraphFont">
     <w:name w:val="Default Paragraph Font"/>
     <w:uiPriority w:val="1"/>
+    <w:semiHidden/>
     <w:unhideWhenUsed/>
   </w:style>
   <w:style w:type="table" w:default="1" w:styleId="TableNormal">

</xml_diff>